<commit_message>
cv: fix gender - Fondateur/Expert (masculin) au lieu de Fondatrice/Experte
</commit_message>
<xml_diff>
--- a/KOA_MARIE_GERVAIS_NELLY_CV_FR.docx
+++ b/KOA_MARIE_GERVAIS_NELLY_CV_FR.docx
@@ -158,7 +158,7 @@
                 <w:color w:val="64748B"/>
                 <w:sz w:val="13"/>
               </w:rPr>
-              <w:t>Fondatrice  ·  Archi Cam AI</w:t>
+              <w:t>Fondateur  ·  Archi Cam AI</w:t>
             </w:r>
           </w:p>
           <w:p>
@@ -411,14 +411,14 @@
                 <w:color w:val="F8FAFC"/>
                 <w:sz w:val="15"/>
               </w:rPr>
-              <w:t xml:space="preserve">Firebase Genkit     </w:t>
+              <w:t xml:space="preserve">Firebase Genkit      </w:t>
             </w:r>
             <w:r>
               <w:rPr>
                 <w:color w:val="F8FAFC"/>
                 <w:sz w:val="15"/>
               </w:rPr>
-              <w:t xml:space="preserve">    ■ ■ ■ ■ ■</w:t>
+              <w:t xml:space="preserve">   ■ ■ ■ ■ ■</w:t>
             </w:r>
           </w:p>
           <w:p>
@@ -526,14 +526,7 @@
                 <w:b/>
                 <w:color w:val="38BDF8"/>
               </w:rPr>
-              <w:t xml:space="preserve">DEV &amp; </w:t>
-            </w:r>
-            <w:r>
-              <w:rPr>
-                <w:b/>
-                <w:color w:val="38BDF8"/>
-              </w:rPr>
-              <w:t>MLOPS</w:t>
+              <w:t>DEV &amp; MLOPS</w:t>
             </w:r>
           </w:p>
           <w:p>
@@ -641,14 +634,14 @@
                 <w:color w:val="0284C7"/>
                 <w:sz w:val="10"/>
               </w:rPr>
-              <w:t>━</w:t>
+              <w:t>━━━━━━</w:t>
             </w:r>
             <w:r>
               <w:rPr>
                 <w:color w:val="0284C7"/>
                 <w:sz w:val="10"/>
               </w:rPr>
-              <w:t>━━━━━━━━━━━━━━━━━━━</w:t>
+              <w:t>━━━━━━━━━━━━━━</w:t>
             </w:r>
           </w:p>
           <w:p>
@@ -756,14 +749,7 @@
                 <w:color w:val="F8FAFC"/>
                 <w:sz w:val="15"/>
               </w:rPr>
-              <w:t xml:space="preserve">Anglais   —  Technique &amp; </w:t>
-            </w:r>
-            <w:r>
-              <w:rPr>
-                <w:color w:val="F8FAFC"/>
-                <w:sz w:val="15"/>
-              </w:rPr>
-              <w:t>Pro</w:t>
+              <w:t>Anglais   —  Technique &amp; Pro</w:t>
             </w:r>
           </w:p>
           <w:p>
@@ -861,7 +847,7 @@
                 <w:color w:val="0284C7"/>
                 <w:sz w:val="19"/>
               </w:rPr>
-              <w:t>Lead AI Engineer &amp; Consultant IA / Data   │   Fondatrice @ Archi Cam AI</w:t>
+              <w:t>Lead AI Engineer &amp; Consultant IA / Data   │   Fondateur @ Archi Cam AI</w:t>
             </w:r>
           </w:p>
           <w:p>
@@ -930,13 +916,13 @@
               <w:rPr>
                 <w:color w:val="334155"/>
               </w:rPr>
-              <w:t>'agents autonomes neuro-symboliques, GraphRAG (Neo4j) et pipelines MLOps souverains avec Google Antigravity. Experte en éthique de l'IA : transparence, explicabilité SHAP, conformité EU AI Act et modèles déterministes zéro-hallucination. Fondatrice d'Archi</w:t>
+              <w:t>'agents autonomes neuro-symboliques, GraphRAG (Neo4j) et pipelines MLOps souverains avec Google Antigravity. Expert en éthique de l'IA : transparence, explicabilité SHAP, conformité EU AI Act et modèles déterministes zéro-hallucination. Fondateur d'Archi C</w:t>
             </w:r>
             <w:r>
               <w:rPr>
                 <w:color w:val="334155"/>
               </w:rPr>
-              <w:t xml:space="preserve"> Cam AI (candidature Google Africa Applied AI Lab 2026), j'allie rigueur mathématique, vision produit et double expertise IA / Génie Civil.</w:t>
+              <w:t>am AI (candidature Google Africa Applied AI Lab 2026), j'allie rigueur mathématique, vision produit et double expertise IA / Génie Civil.</w:t>
             </w:r>
           </w:p>
           <w:p>
@@ -997,7 +983,7 @@
                 <w:color w:val="0284C7"/>
                 <w:sz w:val="15"/>
               </w:rPr>
-              <w:t xml:space="preserve">   —   SaaS IA Agen</w:t>
+              <w:t xml:space="preserve">   —   SaaS IA Agenti</w:t>
             </w:r>
             <w:r>
               <w:rPr>
@@ -1005,7 +991,7 @@
                 <w:color w:val="0284C7"/>
                 <w:sz w:val="15"/>
               </w:rPr>
-              <w:t>tique &amp; 5D BIM</w:t>
+              <w:t>que &amp; 5D BIM</w:t>
             </w:r>
           </w:p>
           <w:p>
@@ -14554,7 +14540,7 @@
 </file>
 
 <file path=customXml/itemProps1.xml><?xml version="1.0" encoding="utf-8"?>
-<ds:datastoreItem xmlns:ds="http://schemas.openxmlformats.org/officeDocument/2006/customXml" ds:itemID="{C3B119A6-E6D9-4C0A-97DF-A4E1E29F7FAF}">
+<ds:datastoreItem xmlns:ds="http://schemas.openxmlformats.org/officeDocument/2006/customXml" ds:itemID="{3F8C3BD7-815B-4BB5-B2E4-DA985A01FCF4}">
   <ds:schemaRefs>
     <ds:schemaRef ds:uri="http://schemas.openxmlformats.org/officeDocument/2006/bibliography"/>
   </ds:schemaRefs>

</xml_diff>